<commit_message>
Polish CV docx: fix duplicates, add live demo URL, add RAG/Groq to skills
</commit_message>
<xml_diff>
--- a/Mohamed_Ghoniem_CV.docx
+++ b/Mohamed_Ghoniem_CV.docx
@@ -132,18 +132,7 @@
         <w:spacing w:after="40" w:line="240" w:lineRule="auto"/>
       </w:pPr>
       <w:r>
-        <w:rPr>
-          <w:b/>
-          <w:sz w:val="20"/>
-        </w:rPr>
-        <w:t xml:space="preserve">NLP &amp; AI: </w:t>
-      </w:r>
-      <w:r>
-        <w:rPr>
-          <w:b w:val="0"/>
-          <w:sz w:val="20"/>
-        </w:rPr>
-        <w:t>LangChain, spaCy, TF-IDF, Word2Vec, text preprocessing, intent classification, attention mechanisms</w:t>
+        <w:t>NLP &amp; AI: LangChain, spaCy, TF-IDF, Word2Vec, text preprocessing, intent classification, attention mechanisms, RAG systems, Groq API</w:t>
       </w:r>
     </w:p>
     <w:p>
@@ -416,7 +405,7 @@
         </w:rPr>
       </w:pPr>
       <w:r>
-        <w:t>Culinary Arts RAG System |  Python, LangChain, LangGraph, FAISS, HuggingFace, Groq, Streamlit, Docker, HuggingFace Spaces</w:t>
+        <w:t>Culinary Arts RAG System |  Python, LangChain, LangGraph, FAISS, Groq, Streamlit, Docker, HuggingFace Spaces</w:t>
       </w:r>
     </w:p>
     <w:p>
@@ -505,7 +494,7 @@
         </w:rPr>
       </w:pPr>
       <w:r>
-        <w:t>• Integrated Grok (xAI) LLM for grounded, citation-anchored generation with zero hallucination, inline source/page references, and automated domain disclaimers</w:t>
+        <w:t>• Integrated Groq LLM for grounded, citation-anchored generation with zero hallucination, inline source/page references, and automated domain disclaimers</w:t>
       </w:r>
     </w:p>
     <w:p>
@@ -578,36 +567,7 @@
         </w:rPr>
       </w:pPr>
       <w:r>
-        <w:rPr>
-          <w:sz w:val="20"/>
-        </w:rPr>
-        <w:t>•</w:t>
-      </w:r>
-      <w:r>
-        <w:rPr>
-          <w:sz w:val="20"/>
-        </w:rPr>
-        <w:t xml:space="preserve"> Engineered robust document ingestion pipeline with PDF/DOCX parsing, </w:t>
-      </w:r>
-      <w:proofErr w:type="spellStart"/>
-      <w:r>
-        <w:rPr>
-          <w:sz w:val="20"/>
-        </w:rPr>
-        <w:t>RecursiveCharacterTextSplitter</w:t>
-      </w:r>
-      <w:proofErr w:type="spellEnd"/>
-      <w:r>
-        <w:rPr>
-          <w:sz w:val="20"/>
-        </w:rPr>
-        <w:t xml:space="preserve"> chunking (512/64), and FAISS index persistence — supporting runtime KB expansion without full rebuilds</w:t>
-      </w:r>
-      <w:r>
-        <w:rPr>
-          <w:sz w:val="20"/>
-        </w:rPr>
-        <w:t>.</w:t>
+        <w:t>• Engineered robust document ingestion pipeline with PDF/DOCX parsing, RecursiveCharacterTextSplitter chunking (512/64), and FAISS index persistence — supporting runtime KB expansion without full rebuilds.  • Live demo: https://12412mohamed-culinary-rag-assistant.hf.space</w:t>
       </w:r>
     </w:p>
     <w:p>
@@ -857,6 +817,7 @@
         </w:rPr>
       </w:r>
     </w:p>
+    <w:p/>
     <w:sectPr>
       <w:pgSz w:w="12240" w:h="15840"/>
       <w:pgMar w:top="720" w:right="1080" w:bottom="720" w:left="1080" w:header="720" w:footer="720" w:gutter="0"/>

</xml_diff>